<commit_message>
Deploying to gh-pages from @ Morrison-Lab/psc@7542d14a3ccc524b461834381361a386daf668a6 🚀
</commit_message>
<xml_diff>
--- a/index.docx
+++ b/index.docx
@@ -7,7 +7,7 @@
         <w:pStyle w:val="Title"/>
       </w:pPr>
       <w:r>
-        <w:t xml:space="preserve">Quarto Website Template</w:t>
+        <w:t xml:space="preserve">Principles of Scientific Computing</w:t>
       </w:r>
     </w:p>
     <w:p>
@@ -15,10 +15,10 @@
         <w:pStyle w:val="Date"/>
       </w:pPr>
       <w:r>
-        <w:t xml:space="preserve">Last modified: 2026-10-09 23:47:44 (PDT)</w:t>
+        <w:t xml:space="preserve">Last modified: 2026-10-10 01:40:28 (PDT)</w:t>
       </w:r>
     </w:p>
-    <w:bookmarkStart w:id="17" w:name="welcome"/>
+    <w:bookmarkStart w:id="27" w:name="welcome"/>
     <w:p>
       <w:pPr>
         <w:pStyle w:val="Heading1"/>
@@ -32,7 +32,45 @@
         <w:pStyle w:val="FirstParagraph"/>
       </w:pPr>
       <w:r>
-        <w:t xml:space="preserve">This is a Quarto website template that you can use to create your own website.</w:t>
+        <w:rPr>
+          <w:i/>
+          <w:iCs/>
+        </w:rPr>
+        <w:t xml:space="preserve">Principles of Scientific Computing</w:t>
+      </w:r>
+      <w:r>
+        <w:t xml:space="preserve"> </w:t>
+      </w:r>
+      <w:r>
+        <w:t xml:space="preserve">(psc) collects practical guidance</w:t>
+      </w:r>
+      <w:r>
+        <w:t xml:space="preserve"> </w:t>
+      </w:r>
+      <w:r>
+        <w:t xml:space="preserve">on writing, organizing, sharing, and maintaining code for research projects.</w:t>
+      </w:r>
+      <w:r>
+        <w:t xml:space="preserve"> </w:t>
+      </w:r>
+      <w:r>
+        <w:t xml:space="preserve">It is the computing companion to</w:t>
+      </w:r>
+      <w:r>
+        <w:t xml:space="preserve"> </w:t>
+      </w:r>
+      <w:hyperlink r:id="rId9">
+        <w:r>
+          <w:rPr>
+            <w:rStyle w:val="Hyperlink"/>
+            <w:i/>
+            <w:iCs/>
+          </w:rPr>
+          <w:t xml:space="preserve">Principles of Scientific Writing</w:t>
+        </w:r>
+      </w:hyperlink>
+      <w:r>
+        <w:t xml:space="preserve">.</w:t>
       </w:r>
     </w:p>
     <w:p>
@@ -40,12 +78,38 @@
         <w:pStyle w:val="BodyText"/>
       </w:pPr>
       <w:r>
-        <w:t xml:space="preserve">The notes are available in multiple formats:</w:t>
+        <w:t xml:space="preserve">The guidance applies to any research project,</w:t>
+      </w:r>
+      <w:r>
+        <w:t xml:space="preserve"> </w:t>
+      </w:r>
+      <w:r>
+        <w:t xml:space="preserve">whether it is a lab analysis, a course, or a software package.</w:t>
+      </w:r>
+      <w:r>
+        <w:t xml:space="preserve"> </w:t>
+      </w:r>
+      <w:r>
+        <w:t xml:space="preserve">Most examples use R,</w:t>
+      </w:r>
+      <w:r>
+        <w:t xml:space="preserve"> </w:t>
+      </w:r>
+      <w:r>
+        <w:t xml:space="preserve">but the principles carry over to other languages.</w:t>
+      </w:r>
+    </w:p>
+    <w:bookmarkStart w:id="22" w:name="whats-here"/>
+    <w:p>
+      <w:pPr>
+        <w:pStyle w:val="Heading2"/>
+      </w:pPr>
+      <w:r>
+        <w:t xml:space="preserve">What’s here</w:t>
       </w:r>
     </w:p>
     <w:p>
       <w:pPr>
-        <w:pStyle w:val="Compact"/>
         <w:numPr>
           <w:ilvl w:val="0"/>
           <w:numId w:val="1001"/>
@@ -56,15 +120,76 @@
           <w:b/>
           <w:bCs/>
         </w:rPr>
-        <w:t xml:space="preserve">HTML Website</w:t>
-      </w:r>
-      <w:r>
-        <w:t xml:space="preserve">: Navigate using the navbar for easy access to all pages</w:t>
+        <w:t xml:space="preserve">Writing code</w:t>
+      </w:r>
+      <w:r>
+        <w:t xml:space="preserve">:</w:t>
+      </w:r>
+      <w:r>
+        <w:t xml:space="preserve"> </w:t>
+      </w:r>
+      <w:hyperlink r:id="rId10">
+        <w:r>
+          <w:rPr>
+            <w:rStyle w:val="Hyperlink"/>
+          </w:rPr>
+          <w:t xml:space="preserve">coding style</w:t>
+        </w:r>
+      </w:hyperlink>
+      <w:r>
+        <w:t xml:space="preserve">,</w:t>
+      </w:r>
+      <w:r>
+        <w:t xml:space="preserve"> </w:t>
+      </w:r>
+      <w:hyperlink r:id="rId11">
+        <w:r>
+          <w:rPr>
+            <w:rStyle w:val="Hyperlink"/>
+          </w:rPr>
+          <w:t xml:space="preserve">coding practices</w:t>
+        </w:r>
+      </w:hyperlink>
+      <w:r>
+        <w:t xml:space="preserve">,</w:t>
+      </w:r>
+      <w:r>
+        <w:t xml:space="preserve"> </w:t>
+      </w:r>
+      <w:hyperlink r:id="rId12">
+        <w:r>
+          <w:rPr>
+            <w:rStyle w:val="Hyperlink"/>
+          </w:rPr>
+          <w:t xml:space="preserve">data masking</w:t>
+        </w:r>
+      </w:hyperlink>
+      <w:r>
+        <w:t xml:space="preserve">,</w:t>
+      </w:r>
+      <w:r>
+        <w:t xml:space="preserve"> </w:t>
+      </w:r>
+      <w:r>
+        <w:t xml:space="preserve">and</w:t>
+      </w:r>
+      <w:r>
+        <w:t xml:space="preserve"> </w:t>
+      </w:r>
+      <w:hyperlink r:id="rId13">
+        <w:r>
+          <w:rPr>
+            <w:rStyle w:val="Hyperlink"/>
+          </w:rPr>
+          <w:t xml:space="preserve">working with big data</w:t>
+        </w:r>
+      </w:hyperlink>
+      <w:r>
+        <w:t xml:space="preserve">.</w:t>
       </w:r>
     </w:p>
     <w:p>
       <w:pPr>
-        <w:pStyle w:val="Compact"/>
         <w:numPr>
           <w:ilvl w:val="0"/>
           <w:numId w:val="1001"/>
@@ -75,30 +200,62 @@
           <w:b/>
           <w:bCs/>
         </w:rPr>
-        <w:t xml:space="preserve">RevealJS Slides</w:t>
-      </w:r>
-      <w:r>
-        <w:t xml:space="preserve">: Each chapter can generate a presentation format with</w:t>
-      </w:r>
-      <w:r>
-        <w:t xml:space="preserve"> </w:t>
-      </w:r>
-      <w:r>
-        <w:rPr>
-          <w:rStyle w:val="VerbatimChar"/>
-        </w:rPr>
-        <w:t xml:space="preserve">-slides.html</w:t>
-      </w:r>
-      <w:r>
-        <w:t xml:space="preserve"> </w:t>
-      </w:r>
-      <w:r>
-        <w:t xml:space="preserve">suffix</w:t>
+        <w:t xml:space="preserve">Projects</w:t>
+      </w:r>
+      <w:r>
+        <w:t xml:space="preserve">:</w:t>
+      </w:r>
+      <w:r>
+        <w:t xml:space="preserve"> </w:t>
+      </w:r>
+      <w:hyperlink r:id="rId14">
+        <w:r>
+          <w:rPr>
+            <w:rStyle w:val="Hyperlink"/>
+          </w:rPr>
+          <w:t xml:space="preserve">code repositories</w:t>
+        </w:r>
+      </w:hyperlink>
+      <w:r>
+        <w:t xml:space="preserve">,</w:t>
+      </w:r>
+      <w:r>
+        <w:t xml:space="preserve"> </w:t>
+      </w:r>
+      <w:hyperlink r:id="rId15">
+        <w:r>
+          <w:rPr>
+            <w:rStyle w:val="Hyperlink"/>
+          </w:rPr>
+          <w:t xml:space="preserve">reproducible environments</w:t>
+        </w:r>
+      </w:hyperlink>
+      <w:r>
+        <w:t xml:space="preserve">,</w:t>
+      </w:r>
+      <w:r>
+        <w:t xml:space="preserve"> </w:t>
+      </w:r>
+      <w:r>
+        <w:t xml:space="preserve">and</w:t>
+      </w:r>
+      <w:r>
+        <w:t xml:space="preserve"> </w:t>
+      </w:r>
+      <w:hyperlink r:id="rId16">
+        <w:r>
+          <w:rPr>
+            <w:rStyle w:val="Hyperlink"/>
+          </w:rPr>
+          <w:t xml:space="preserve">code publication</w:t>
+        </w:r>
+      </w:hyperlink>
+      <w:r>
+        <w:t xml:space="preserve">.</w:t>
       </w:r>
     </w:p>
     <w:p>
       <w:pPr>
-        <w:pStyle w:val="Compact"/>
         <w:numPr>
           <w:ilvl w:val="0"/>
           <w:numId w:val="1001"/>
@@ -109,30 +266,62 @@
           <w:b/>
           <w:bCs/>
         </w:rPr>
-        <w:t xml:space="preserve">PDF Handouts</w:t>
-      </w:r>
-      <w:r>
-        <w:t xml:space="preserve">: Each chapter can generate a PDF handout with</w:t>
-      </w:r>
-      <w:r>
-        <w:t xml:space="preserve"> </w:t>
-      </w:r>
-      <w:r>
-        <w:rPr>
-          <w:rStyle w:val="VerbatimChar"/>
-        </w:rPr>
-        <w:t xml:space="preserve">-handout.pdf</w:t>
-      </w:r>
-      <w:r>
-        <w:t xml:space="preserve"> </w:t>
-      </w:r>
-      <w:r>
-        <w:t xml:space="preserve">suffix</w:t>
+        <w:t xml:space="preserve">Collaboration</w:t>
+      </w:r>
+      <w:r>
+        <w:t xml:space="preserve">:</w:t>
+      </w:r>
+      <w:r>
+        <w:t xml:space="preserve"> </w:t>
+      </w:r>
+      <w:hyperlink r:id="rId17">
+        <w:r>
+          <w:rPr>
+            <w:rStyle w:val="Hyperlink"/>
+          </w:rPr>
+          <w:t xml:space="preserve">Git and GitHub</w:t>
+        </w:r>
+      </w:hyperlink>
+      <w:r>
+        <w:t xml:space="preserve">,</w:t>
+      </w:r>
+      <w:r>
+        <w:t xml:space="preserve"> </w:t>
+      </w:r>
+      <w:hyperlink r:id="rId18">
+        <w:r>
+          <w:rPr>
+            <w:rStyle w:val="Hyperlink"/>
+          </w:rPr>
+          <w:t xml:space="preserve">collaborative software development</w:t>
+        </w:r>
+      </w:hyperlink>
+      <w:r>
+        <w:t xml:space="preserve">,</w:t>
+      </w:r>
+      <w:r>
+        <w:t xml:space="preserve"> </w:t>
+      </w:r>
+      <w:r>
+        <w:t xml:space="preserve">and</w:t>
+      </w:r>
+      <w:r>
+        <w:t xml:space="preserve"> </w:t>
+      </w:r>
+      <w:hyperlink r:id="rId19">
+        <w:r>
+          <w:rPr>
+            <w:rStyle w:val="Hyperlink"/>
+          </w:rPr>
+          <w:t xml:space="preserve">continuous integration</w:t>
+        </w:r>
+      </w:hyperlink>
+      <w:r>
+        <w:t xml:space="preserve">.</w:t>
       </w:r>
     </w:p>
     <w:p>
       <w:pPr>
-        <w:pStyle w:val="Compact"/>
         <w:numPr>
           <w:ilvl w:val="0"/>
           <w:numId w:val="1001"/>
@@ -143,47 +332,32 @@
           <w:b/>
           <w:bCs/>
         </w:rPr>
-        <w:t xml:space="preserve">DOCX Documents</w:t>
-      </w:r>
-      <w:r>
-        <w:t xml:space="preserve">: Each chapter can generate a Microsoft Word document with</w:t>
-      </w:r>
-      <w:r>
-        <w:t xml:space="preserve"> </w:t>
-      </w:r>
-      <w:r>
-        <w:rPr>
-          <w:rStyle w:val="VerbatimChar"/>
-        </w:rPr>
-        <w:t xml:space="preserve">.docx</w:t>
-      </w:r>
-      <w:r>
-        <w:t xml:space="preserve"> </w:t>
-      </w:r>
-      <w:r>
-        <w:t xml:space="preserve">extension</w:t>
-      </w:r>
-    </w:p>
-    <w:bookmarkStart w:id="10" w:name="about-this-website"/>
-    <w:p>
-      <w:pPr>
-        <w:pStyle w:val="Heading2"/>
-      </w:pPr>
-      <w:r>
-        <w:t xml:space="preserve">0.1 About this website</w:t>
-      </w:r>
-    </w:p>
-    <w:p>
-      <w:pPr>
-        <w:pStyle w:val="FirstParagraph"/>
-      </w:pPr>
-      <w:r>
-        <w:t xml:space="preserve">This website is built with</w:t>
-      </w:r>
-      <w:r>
-        <w:t xml:space="preserve"> </w:t>
-      </w:r>
-      <w:hyperlink r:id="rId9">
+        <w:t xml:space="preserve">Tools</w:t>
+      </w:r>
+      <w:r>
+        <w:t xml:space="preserve">:</w:t>
+      </w:r>
+      <w:r>
+        <w:t xml:space="preserve"> </w:t>
+      </w:r>
+      <w:hyperlink r:id="rId20">
+        <w:r>
+          <w:rPr>
+            <w:rStyle w:val="Hyperlink"/>
+          </w:rPr>
+          <w:t xml:space="preserve">the Unix command line</w:t>
+        </w:r>
+      </w:hyperlink>
+      <w:r>
+        <w:t xml:space="preserve"> </w:t>
+      </w:r>
+      <w:r>
+        <w:t xml:space="preserve">and</w:t>
+      </w:r>
+      <w:r>
+        <w:t xml:space="preserve"> </w:t>
+      </w:r>
+      <w:hyperlink r:id="rId21">
         <w:r>
           <w:rPr>
             <w:rStyle w:val="Hyperlink"/>
@@ -192,17 +366,7 @@
         </w:r>
       </w:hyperlink>
       <w:r>
-        <w:t xml:space="preserve">, an open-source scientific and technical publishing system. You can use Quarto to create books, websites, blogs, presentations, and more from markdown files.</w:t>
-      </w:r>
-    </w:p>
-    <w:bookmarkEnd w:id="10"/>
-    <w:bookmarkStart w:id="11" w:name="getting-started"/>
-    <w:p>
-      <w:pPr>
-        <w:pStyle w:val="Heading2"/>
-      </w:pPr>
-      <w:r>
-        <w:t xml:space="preserve">0.2 Getting Started</w:t>
+        <w:t xml:space="preserve">.</w:t>
       </w:r>
     </w:p>
     <w:p>
@@ -210,7 +374,56 @@
         <w:pStyle w:val="FirstParagraph"/>
       </w:pPr>
       <w:r>
-        <w:t xml:space="preserve">To use this template:</w:t>
+        <w:t xml:space="preserve">Each page is also available as RevealJS slides (</w:t>
+      </w:r>
+      <w:r>
+        <w:rPr>
+          <w:rStyle w:val="VerbatimChar"/>
+        </w:rPr>
+        <w:t xml:space="preserve">-slides.html</w:t>
+      </w:r>
+      <w:r>
+        <w:t xml:space="preserve">),</w:t>
+      </w:r>
+      <w:r>
+        <w:t xml:space="preserve"> </w:t>
+      </w:r>
+      <w:r>
+        <w:t xml:space="preserve">a PDF handout (</w:t>
+      </w:r>
+      <w:r>
+        <w:rPr>
+          <w:rStyle w:val="VerbatimChar"/>
+        </w:rPr>
+        <w:t xml:space="preserve">-handout.pdf</w:t>
+      </w:r>
+      <w:r>
+        <w:t xml:space="preserve">),</w:t>
+      </w:r>
+      <w:r>
+        <w:t xml:space="preserve"> </w:t>
+      </w:r>
+      <w:r>
+        <w:t xml:space="preserve">and a Word document (</w:t>
+      </w:r>
+      <w:r>
+        <w:rPr>
+          <w:rStyle w:val="VerbatimChar"/>
+        </w:rPr>
+        <w:t xml:space="preserve">.docx</w:t>
+      </w:r>
+      <w:r>
+        <w:t xml:space="preserve">).</w:t>
+      </w:r>
+    </w:p>
+    <w:bookmarkEnd w:id="22"/>
+    <w:bookmarkStart w:id="25" w:name="related-guides"/>
+    <w:p>
+      <w:pPr>
+        <w:pStyle w:val="Heading2"/>
+      </w:pPr>
+      <w:r>
+        <w:t xml:space="preserve">Related guides</w:t>
       </w:r>
     </w:p>
     <w:p>
@@ -220,30 +433,21 @@
           <w:numId w:val="1002"/>
         </w:numPr>
       </w:pPr>
-      <w:r>
-        <w:rPr>
-          <w:b/>
-          <w:bCs/>
-        </w:rPr>
-        <w:t xml:space="preserve">Update the configuration</w:t>
-      </w:r>
-      <w:r>
-        <w:t xml:space="preserve">: Edit</w:t>
-      </w:r>
-      <w:r>
-        <w:t xml:space="preserve"> </w:t>
-      </w:r>
-      <w:r>
-        <w:rPr>
-          <w:rStyle w:val="VerbatimChar"/>
-        </w:rPr>
-        <w:t xml:space="preserve">_quarto-website.yml</w:t>
-      </w:r>
-      <w:r>
-        <w:t xml:space="preserve"> </w:t>
-      </w:r>
-      <w:r>
-        <w:t xml:space="preserve">to change the website title, site URL, and navigation menu.</w:t>
+      <w:hyperlink r:id="rId9">
+        <w:r>
+          <w:rPr>
+            <w:rStyle w:val="Hyperlink"/>
+            <w:i/>
+            <w:iCs/>
+          </w:rPr>
+          <w:t xml:space="preserve">Principles of Scientific Writing</w:t>
+        </w:r>
+      </w:hyperlink>
+      <w:r>
+        <w:t xml:space="preserve"> </w:t>
+      </w:r>
+      <w:r>
+        <w:t xml:space="preserve">covers writing about research and statistical analysis.</w:t>
       </w:r>
     </w:p>
     <w:p>
@@ -253,45 +457,21 @@
           <w:numId w:val="1002"/>
         </w:numPr>
       </w:pPr>
-      <w:r>
-        <w:rPr>
-          <w:b/>
-          <w:bCs/>
-        </w:rPr>
-        <w:t xml:space="preserve">Add your content</w:t>
-      </w:r>
-      <w:r>
-        <w:t xml:space="preserve">: Create new</w:t>
-      </w:r>
-      <w:r>
-        <w:t xml:space="preserve"> </w:t>
-      </w:r>
-      <w:r>
-        <w:rPr>
-          <w:rStyle w:val="VerbatimChar"/>
-        </w:rPr>
-        <w:t xml:space="preserve">.qmd</w:t>
-      </w:r>
-      <w:r>
-        <w:t xml:space="preserve"> </w:t>
-      </w:r>
-      <w:r>
-        <w:t xml:space="preserve">files for each page and add them to the navigation menu and the sidebar in</w:t>
-      </w:r>
-      <w:r>
-        <w:t xml:space="preserve"> </w:t>
-      </w:r>
-      <w:r>
-        <w:rPr>
-          <w:rStyle w:val="VerbatimChar"/>
-        </w:rPr>
-        <w:t xml:space="preserve">_quarto-website.yml</w:t>
-      </w:r>
-      <w:r>
-        <w:t xml:space="preserve"> </w:t>
-      </w:r>
-      <w:r>
-        <w:t xml:space="preserve">(the sidebar order sets the previous/next page links).</w:t>
+      <w:hyperlink r:id="rId23">
+        <w:r>
+          <w:rPr>
+            <w:rStyle w:val="Hyperlink"/>
+            <w:i/>
+            <w:iCs/>
+          </w:rPr>
+          <w:t xml:space="preserve">Working with AI</w:t>
+        </w:r>
+      </w:hyperlink>
+      <w:r>
+        <w:t xml:space="preserve"> </w:t>
+      </w:r>
+      <w:r>
+        <w:t xml:space="preserve">covers AI coding assistants and agent-driven pull requests.</w:t>
       </w:r>
     </w:p>
     <w:p>
@@ -302,309 +482,70 @@
         </w:numPr>
       </w:pPr>
       <w:r>
-        <w:rPr>
-          <w:b/>
-          <w:bCs/>
-        </w:rPr>
-        <w:t xml:space="preserve">Customize the style</w:t>
-      </w:r>
-      <w:r>
-        <w:t xml:space="preserve">: Modify</w:t>
-      </w:r>
-      <w:r>
-        <w:t xml:space="preserve"> </w:t>
-      </w:r>
-      <w:r>
-        <w:rPr>
-          <w:rStyle w:val="VerbatimChar"/>
-        </w:rPr>
-        <w:t xml:space="preserve">styles.css</w:t>
-      </w:r>
-      <w:r>
-        <w:t xml:space="preserve"> </w:t>
-      </w:r>
-      <w:r>
-        <w:t xml:space="preserve">to change the appearance of your website.</w:t>
+        <w:t xml:space="preserve">The</w:t>
+      </w:r>
+      <w:r>
+        <w:t xml:space="preserve"> </w:t>
+      </w:r>
+      <w:hyperlink r:id="rId24">
+        <w:r>
+          <w:rPr>
+            <w:rStyle w:val="Hyperlink"/>
+          </w:rPr>
+          <w:t xml:space="preserve">UCD-SERG lab manual</w:t>
+        </w:r>
+      </w:hyperlink>
+      <w:r>
+        <w:t xml:space="preserve"> </w:t>
+      </w:r>
+      <w:r>
+        <w:t xml:space="preserve">covers policies and resources specific to the</w:t>
+      </w:r>
+      <w:r>
+        <w:t xml:space="preserve"> </w:t>
+      </w:r>
+      <w:r>
+        <w:t xml:space="preserve">UC Davis Seroepidemiology Research Group,</w:t>
+      </w:r>
+      <w:r>
+        <w:t xml:space="preserve"> </w:t>
+      </w:r>
+      <w:r>
+        <w:t xml:space="preserve">such as computing clusters, onboarding, and communication.</w:t>
+      </w:r>
+    </w:p>
+    <w:bookmarkEnd w:id="25"/>
+    <w:bookmarkStart w:id="26" w:name="origin"/>
+    <w:p>
+      <w:pPr>
+        <w:pStyle w:val="Heading2"/>
+      </w:pPr>
+      <w:r>
+        <w:t xml:space="preserve">Origin</w:t>
       </w:r>
     </w:p>
     <w:p>
       <w:pPr>
-        <w:numPr>
-          <w:ilvl w:val="0"/>
-          <w:numId w:val="1002"/>
-        </w:numPr>
-      </w:pPr>
-      <w:r>
-        <w:rPr>
-          <w:b/>
-          <w:bCs/>
-        </w:rPr>
-        <w:t xml:space="preserve">Add references</w:t>
-      </w:r>
-      <w:r>
-        <w:t xml:space="preserve">: Update</w:t>
-      </w:r>
-      <w:r>
-        <w:t xml:space="preserve"> </w:t>
-      </w:r>
-      <w:r>
-        <w:rPr>
-          <w:rStyle w:val="VerbatimChar"/>
-        </w:rPr>
-        <w:t xml:space="preserve">references.bib</w:t>
-      </w:r>
-      <w:r>
-        <w:t xml:space="preserve"> </w:t>
-      </w:r>
-      <w:r>
-        <w:t xml:space="preserve">with your citations.</w:t>
+        <w:pStyle w:val="FirstParagraph"/>
+      </w:pPr>
+      <w:r>
+        <w:t xml:space="preserve">These chapters began in the UCD-SERG lab manual</w:t>
+      </w:r>
+      <w:r>
+        <w:t xml:space="preserve"> </w:t>
+      </w:r>
+      <w:r>
+        <w:t xml:space="preserve">and moved here, with their history, so that they can serve projects</w:t>
+      </w:r>
+      <w:r>
+        <w:t xml:space="preserve"> </w:t>
+      </w:r>
+      <w:r>
+        <w:t xml:space="preserve">outside that group.</w:t>
       </w:r>
     </w:p>
-    <w:bookmarkEnd w:id="11"/>
-    <w:bookmarkStart w:id="12" w:name="building-the-website"/>
-    <w:p>
-      <w:pPr>
-        <w:pStyle w:val="Heading2"/>
-      </w:pPr>
-      <w:r>
-        <w:t xml:space="preserve">0.3 Building the website</w:t>
-      </w:r>
-    </w:p>
-    <w:p>
-      <w:pPr>
-        <w:pStyle w:val="FirstParagraph"/>
-      </w:pPr>
-      <w:r>
-        <w:t xml:space="preserve">To render the website locally:</w:t>
-      </w:r>
-    </w:p>
-    <w:p>
-      <w:pPr>
-        <w:pStyle w:val="SourceCode"/>
-      </w:pPr>
-      <w:r>
-        <w:rPr>
-          <w:rStyle w:val="ExtensionTok"/>
-        </w:rPr>
-        <w:t xml:space="preserve">quarto</w:t>
-      </w:r>
-      <w:r>
-        <w:rPr>
-          <w:rStyle w:val="NormalTok"/>
-        </w:rPr>
-        <w:t xml:space="preserve"> render</w:t>
-      </w:r>
-    </w:p>
-    <w:p>
-      <w:pPr>
-        <w:pStyle w:val="FirstParagraph"/>
-      </w:pPr>
-      <w:r>
-        <w:t xml:space="preserve">To preview the website with live reload:</w:t>
-      </w:r>
-    </w:p>
-    <w:p>
-      <w:pPr>
-        <w:pStyle w:val="SourceCode"/>
-      </w:pPr>
-      <w:r>
-        <w:rPr>
-          <w:rStyle w:val="ExtensionTok"/>
-        </w:rPr>
-        <w:t xml:space="preserve">quarto</w:t>
-      </w:r>
-      <w:r>
-        <w:rPr>
-          <w:rStyle w:val="NormalTok"/>
-        </w:rPr>
-        <w:t xml:space="preserve"> preview</w:t>
-      </w:r>
-    </w:p>
-    <w:p>
-      <w:pPr>
-        <w:pStyle w:val="FirstParagraph"/>
-      </w:pPr>
-      <w:r>
-        <w:t xml:space="preserve">The rendered output will be in the</w:t>
-      </w:r>
-      <w:r>
-        <w:t xml:space="preserve"> </w:t>
-      </w:r>
-      <w:r>
-        <w:rPr>
-          <w:rStyle w:val="VerbatimChar"/>
-        </w:rPr>
-        <w:t xml:space="preserve">_site/</w:t>
-      </w:r>
-      <w:r>
-        <w:t xml:space="preserve"> </w:t>
-      </w:r>
-      <w:r>
-        <w:t xml:space="preserve">directory, which can be published to GitHub Pages.</w:t>
-      </w:r>
-    </w:p>
-    <w:bookmarkEnd w:id="12"/>
-    <w:bookmarkStart w:id="13" w:name="publishing-to-github-pages"/>
-    <w:p>
-      <w:pPr>
-        <w:pStyle w:val="Heading2"/>
-      </w:pPr>
-      <w:r>
-        <w:t xml:space="preserve">0.4 Publishing to GitHub Pages</w:t>
-      </w:r>
-    </w:p>
-    <w:p>
-      <w:pPr>
-        <w:pStyle w:val="FirstParagraph"/>
-      </w:pPr>
-      <w:r>
-        <w:t xml:space="preserve">This template includes a GitHub Actions workflow that automatically builds and publishes your website to GitHub Pages when you push to the main branch.</w:t>
-      </w:r>
-    </w:p>
-    <w:p>
-      <w:pPr>
-        <w:pStyle w:val="BodyText"/>
-      </w:pPr>
-      <w:r>
-        <w:t xml:space="preserve">To enable GitHub Pages:</w:t>
-      </w:r>
-    </w:p>
-    <w:p>
-      <w:pPr>
-        <w:pStyle w:val="Compact"/>
-        <w:numPr>
-          <w:ilvl w:val="0"/>
-          <w:numId w:val="1003"/>
-        </w:numPr>
-      </w:pPr>
-      <w:r>
-        <w:t xml:space="preserve">Go to your repository settings</w:t>
-      </w:r>
-    </w:p>
-    <w:p>
-      <w:pPr>
-        <w:pStyle w:val="Compact"/>
-        <w:numPr>
-          <w:ilvl w:val="0"/>
-          <w:numId w:val="1003"/>
-        </w:numPr>
-      </w:pPr>
-      <w:r>
-        <w:t xml:space="preserve">Navigate to</w:t>
-      </w:r>
-      <w:r>
-        <w:t xml:space="preserve"> </w:t>
-      </w:r>
-      <w:r>
-        <w:t xml:space="preserve">“Pages”</w:t>
-      </w:r>
-      <w:r>
-        <w:t xml:space="preserve"> </w:t>
-      </w:r>
-      <w:r>
-        <w:t xml:space="preserve">in the left sidebar</w:t>
-      </w:r>
-    </w:p>
-    <w:p>
-      <w:pPr>
-        <w:pStyle w:val="Compact"/>
-        <w:numPr>
-          <w:ilvl w:val="0"/>
-          <w:numId w:val="1003"/>
-        </w:numPr>
-      </w:pPr>
-      <w:r>
-        <w:t xml:space="preserve">Under</w:t>
-      </w:r>
-      <w:r>
-        <w:t xml:space="preserve"> </w:t>
-      </w:r>
-      <w:r>
-        <w:t xml:space="preserve">“Build and deployment”</w:t>
-      </w:r>
-      <w:r>
-        <w:t xml:space="preserve">, set Source to</w:t>
-      </w:r>
-      <w:r>
-        <w:t xml:space="preserve"> </w:t>
-      </w:r>
-      <w:r>
-        <w:t xml:space="preserve">“GitHub Actions”</w:t>
-      </w:r>
-    </w:p>
-    <w:p>
-      <w:pPr>
-        <w:pStyle w:val="Compact"/>
-        <w:numPr>
-          <w:ilvl w:val="0"/>
-          <w:numId w:val="1003"/>
-        </w:numPr>
-      </w:pPr>
-      <w:r>
-        <w:t xml:space="preserve">Push your changes to the main branch</w:t>
-      </w:r>
-    </w:p>
-    <w:p>
-      <w:pPr>
-        <w:pStyle w:val="Compact"/>
-        <w:numPr>
-          <w:ilvl w:val="0"/>
-          <w:numId w:val="1003"/>
-        </w:numPr>
-      </w:pPr>
-      <w:r>
-        <w:t xml:space="preserve">The workflow will automatically build and deploy your website</w:t>
-      </w:r>
-    </w:p>
-    <w:p>
-      <w:pPr>
-        <w:pStyle w:val="FirstParagraph"/>
-      </w:pPr>
-      <w:r>
-        <w:t xml:space="preserve">Your website will be available at</w:t>
-      </w:r>
-      <w:r>
-        <w:t xml:space="preserve"> </w:t>
-      </w:r>
-      <w:r>
-        <w:rPr>
-          <w:rStyle w:val="VerbatimChar"/>
-        </w:rPr>
-        <w:t xml:space="preserve">https://YOUR-USERNAME.github.io/YOUR-REPO/</w:t>
-      </w:r>
-    </w:p>
-    <w:bookmarkEnd w:id="13"/>
-    <w:bookmarkStart w:id="14" w:name="license"/>
-    <w:p>
-      <w:pPr>
-        <w:pStyle w:val="Heading2"/>
-      </w:pPr>
-      <w:r>
-        <w:t xml:space="preserve">0.5 License</w:t>
-      </w:r>
-    </w:p>
-    <w:p>
-      <w:pPr>
-        <w:pStyle w:val="FirstParagraph"/>
-      </w:pPr>
-      <w:r>
-        <w:t xml:space="preserve">Add your license information here.</w:t>
-      </w:r>
-    </w:p>
-    <w:bookmarkEnd w:id="14"/>
-    <w:bookmarkStart w:id="16" w:name="references"/>
-    <w:p>
-      <w:pPr>
-        <w:pStyle w:val="Heading2"/>
-      </w:pPr>
-      <w:r>
-        <w:t xml:space="preserve">References</w:t>
-      </w:r>
-    </w:p>
-    <w:bookmarkStart w:id="15" w:name="refs"/>
-    <w:bookmarkEnd w:id="15"/>
-    <w:bookmarkEnd w:id="16"/>
-    <w:bookmarkEnd w:id="17"/>
+    <w:bookmarkEnd w:id="26"/>
+    <w:bookmarkEnd w:id="27"/>
     <w:sectPr>
       <w:footnotePr>
         <w:numRestart w:val="eachSect"/>
@@ -818,91 +759,6 @@
       </w:rPr>
     </w:lvl>
   </w:abstractNum>
-  <w:abstractNum w:abstractNumId="99411">
-    <w:nsid w:val="00A99411"/>
-    <w:multiLevelType w:val="multilevel"/>
-    <w:lvl w:ilvl="0">
-      <w:start w:val="1"/>
-      <w:numFmt w:val="decimal"/>
-      <w:lvlText w:val="%1."/>
-      <w:lvlJc w:val="left"/>
-      <w:pPr>
-        <w:ind w:left="720" w:hanging="360"/>
-      </w:pPr>
-    </w:lvl>
-    <w:lvl w:ilvl="1">
-      <w:start w:val="1"/>
-      <w:numFmt w:val="decimal"/>
-      <w:lvlText w:val="%2."/>
-      <w:lvlJc w:val="left"/>
-      <w:pPr>
-        <w:ind w:left="1440" w:hanging="360"/>
-      </w:pPr>
-    </w:lvl>
-    <w:lvl w:ilvl="2">
-      <w:start w:val="1"/>
-      <w:numFmt w:val="decimal"/>
-      <w:lvlText w:val="%3."/>
-      <w:lvlJc w:val="left"/>
-      <w:pPr>
-        <w:ind w:left="2160" w:hanging="360"/>
-      </w:pPr>
-    </w:lvl>
-    <w:lvl w:ilvl="3">
-      <w:start w:val="1"/>
-      <w:numFmt w:val="decimal"/>
-      <w:lvlText w:val="%4."/>
-      <w:lvlJc w:val="left"/>
-      <w:pPr>
-        <w:ind w:left="2880" w:hanging="360"/>
-      </w:pPr>
-    </w:lvl>
-    <w:lvl w:ilvl="4">
-      <w:start w:val="1"/>
-      <w:numFmt w:val="decimal"/>
-      <w:lvlText w:val="%5."/>
-      <w:lvlJc w:val="left"/>
-      <w:pPr>
-        <w:ind w:left="3600" w:hanging="360"/>
-      </w:pPr>
-    </w:lvl>
-    <w:lvl w:ilvl="5">
-      <w:start w:val="1"/>
-      <w:numFmt w:val="decimal"/>
-      <w:lvlText w:val="%6."/>
-      <w:lvlJc w:val="left"/>
-      <w:pPr>
-        <w:ind w:left="4320" w:hanging="360"/>
-      </w:pPr>
-    </w:lvl>
-    <w:lvl w:ilvl="6">
-      <w:start w:val="1"/>
-      <w:numFmt w:val="decimal"/>
-      <w:lvlText w:val="%7."/>
-      <w:lvlJc w:val="left"/>
-      <w:pPr>
-        <w:ind w:left="5040" w:hanging="360"/>
-      </w:pPr>
-    </w:lvl>
-    <w:lvl w:ilvl="7">
-      <w:start w:val="1"/>
-      <w:numFmt w:val="decimal"/>
-      <w:lvlText w:val="%8."/>
-      <w:lvlJc w:val="left"/>
-      <w:pPr>
-        <w:ind w:left="5760" w:hanging="360"/>
-      </w:pPr>
-    </w:lvl>
-    <w:lvl w:ilvl="8">
-      <w:start w:val="1"/>
-      <w:numFmt w:val="decimal"/>
-      <w:lvlText w:val="%9."/>
-      <w:lvlJc w:val="left"/>
-      <w:pPr>
-        <w:ind w:left="6480" w:hanging="360"/>
-      </w:pPr>
-    </w:lvl>
-  </w:abstractNum>
   <w:num w:numId="1000">
     <w:abstractNumId w:val="990"/>
   </w:num>
@@ -910,64 +766,7 @@
     <w:abstractNumId w:val="991"/>
   </w:num>
   <w:num w:numId="1002">
-    <w:abstractNumId w:val="99411"/>
-    <w:lvlOverride w:ilvl="0">
-      <w:startOverride w:val="1"/>
-    </w:lvlOverride>
-    <w:lvlOverride w:ilvl="1">
-      <w:startOverride w:val="1"/>
-    </w:lvlOverride>
-    <w:lvlOverride w:ilvl="2">
-      <w:startOverride w:val="1"/>
-    </w:lvlOverride>
-    <w:lvlOverride w:ilvl="3">
-      <w:startOverride w:val="1"/>
-    </w:lvlOverride>
-    <w:lvlOverride w:ilvl="4">
-      <w:startOverride w:val="1"/>
-    </w:lvlOverride>
-    <w:lvlOverride w:ilvl="5">
-      <w:startOverride w:val="1"/>
-    </w:lvlOverride>
-    <w:lvlOverride w:ilvl="6">
-      <w:startOverride w:val="1"/>
-    </w:lvlOverride>
-    <w:lvlOverride w:ilvl="7">
-      <w:startOverride w:val="1"/>
-    </w:lvlOverride>
-    <w:lvlOverride w:ilvl="8">
-      <w:startOverride w:val="1"/>
-    </w:lvlOverride>
-  </w:num>
-  <w:num w:numId="1003">
-    <w:abstractNumId w:val="99411"/>
-    <w:lvlOverride w:ilvl="0">
-      <w:startOverride w:val="1"/>
-    </w:lvlOverride>
-    <w:lvlOverride w:ilvl="1">
-      <w:startOverride w:val="1"/>
-    </w:lvlOverride>
-    <w:lvlOverride w:ilvl="2">
-      <w:startOverride w:val="1"/>
-    </w:lvlOverride>
-    <w:lvlOverride w:ilvl="3">
-      <w:startOverride w:val="1"/>
-    </w:lvlOverride>
-    <w:lvlOverride w:ilvl="4">
-      <w:startOverride w:val="1"/>
-    </w:lvlOverride>
-    <w:lvlOverride w:ilvl="5">
-      <w:startOverride w:val="1"/>
-    </w:lvlOverride>
-    <w:lvlOverride w:ilvl="6">
-      <w:startOverride w:val="1"/>
-    </w:lvlOverride>
-    <w:lvlOverride w:ilvl="7">
-      <w:startOverride w:val="1"/>
-    </w:lvlOverride>
-    <w:lvlOverride w:ilvl="8">
-      <w:startOverride w:val="1"/>
-    </w:lvlOverride>
+    <w:abstractNumId w:val="991"/>
   </w:num>
 </w:numbering>
 </file>

</xml_diff>

<commit_message>
Deploying to gh-pages from @ Morrison-Lab/psc@6ecef200176128599253112078db41140126545f 🚀
</commit_message>
<xml_diff>
--- a/index.docx
+++ b/index.docx
@@ -15,10 +15,10 @@
         <w:pStyle w:val="Date"/>
       </w:pPr>
       <w:r>
-        <w:t xml:space="preserve">Last modified: 2026-10-10 01:40:28 (PDT)</w:t>
+        <w:t xml:space="preserve">Last modified: 2026-10-11 02:07:28 (PDT)</w:t>
       </w:r>
     </w:p>
-    <w:bookmarkStart w:id="27" w:name="welcome"/>
+    <w:bookmarkStart w:id="29" w:name="welcome"/>
     <w:p>
       <w:pPr>
         <w:pStyle w:val="Heading1"/>
@@ -515,7 +515,7 @@
       </w:r>
     </w:p>
     <w:bookmarkEnd w:id="25"/>
-    <w:bookmarkStart w:id="26" w:name="origin"/>
+    <w:bookmarkStart w:id="28" w:name="origin"/>
     <w:p>
       <w:pPr>
         <w:pStyle w:val="Heading2"/>
@@ -529,8 +529,19 @@
         <w:pStyle w:val="FirstParagraph"/>
       </w:pPr>
       <w:r>
-        <w:t xml:space="preserve">These chapters began in the UCD-SERG lab manual</w:t>
-      </w:r>
+        <w:t xml:space="preserve">These chapters began in the</w:t>
+      </w:r>
+      <w:r>
+        <w:t xml:space="preserve"> </w:t>
+      </w:r>
+      <w:hyperlink r:id="rId24">
+        <w:r>
+          <w:rPr>
+            <w:rStyle w:val="Hyperlink"/>
+          </w:rPr>
+          <w:t xml:space="preserve">UCD-SERG lab manual</w:t>
+        </w:r>
+      </w:hyperlink>
       <w:r>
         <w:t xml:space="preserve"> </w:t>
       </w:r>
@@ -544,8 +555,121 @@
         <w:t xml:space="preserve">outside that group.</w:t>
       </w:r>
     </w:p>
-    <w:bookmarkEnd w:id="26"/>
-    <w:bookmarkEnd w:id="27"/>
+    <w:p>
+      <w:pPr>
+        <w:pStyle w:val="BodyText"/>
+      </w:pPr>
+      <w:r>
+        <w:t xml:space="preserve">The UCD-SERG lab manual is a fork of the</w:t>
+      </w:r>
+      <w:r>
+        <w:t xml:space="preserve"> </w:t>
+      </w:r>
+      <w:hyperlink r:id="rId26">
+        <w:r>
+          <w:rPr>
+            <w:rStyle w:val="Hyperlink"/>
+          </w:rPr>
+          <w:t xml:space="preserve">Benjamin-Chung Lab Manual</w:t>
+        </w:r>
+      </w:hyperlink>
+      <w:r>
+        <w:t xml:space="preserve">,</w:t>
+      </w:r>
+      <w:r>
+        <w:t xml:space="preserve"> </w:t>
+      </w:r>
+      <w:r>
+        <w:t xml:space="preserve">and many of these chapters keep text from the Benjamin-Chung manual.</w:t>
+      </w:r>
+      <w:r>
+        <w:t xml:space="preserve"> </w:t>
+      </w:r>
+      <w:r>
+        <w:t xml:space="preserve">We are grateful to Jade Benjamin-Chung</w:t>
+      </w:r>
+      <w:r>
+        <w:t xml:space="preserve"> </w:t>
+      </w:r>
+      <w:r>
+        <w:t xml:space="preserve">and that manual’s other original contributors,</w:t>
+      </w:r>
+      <w:r>
+        <w:t xml:space="preserve"> </w:t>
+      </w:r>
+      <w:r>
+        <w:t xml:space="preserve">Kunal Mishra,</w:t>
+      </w:r>
+      <w:r>
+        <w:t xml:space="preserve"> </w:t>
+      </w:r>
+      <w:r>
+        <w:t xml:space="preserve">Stephanie Djajadi,</w:t>
+      </w:r>
+      <w:r>
+        <w:t xml:space="preserve"> </w:t>
+      </w:r>
+      <w:r>
+        <w:t xml:space="preserve">Nolan Pokpongkiat,</w:t>
+      </w:r>
+      <w:r>
+        <w:t xml:space="preserve"> </w:t>
+      </w:r>
+      <w:r>
+        <w:t xml:space="preserve">Anna Nguyen,</w:t>
+      </w:r>
+      <w:r>
+        <w:t xml:space="preserve"> </w:t>
+      </w:r>
+      <w:r>
+        <w:t xml:space="preserve">Iris Tong,</w:t>
+      </w:r>
+      <w:r>
+        <w:t xml:space="preserve"> </w:t>
+      </w:r>
+      <w:r>
+        <w:t xml:space="preserve">and Gabby Barratt Heitmann,</w:t>
+      </w:r>
+      <w:r>
+        <w:t xml:space="preserve"> </w:t>
+      </w:r>
+      <w:r>
+        <w:t xml:space="preserve">for writing the manual and sharing it openly.</w:t>
+      </w:r>
+    </w:p>
+    <w:p>
+      <w:pPr>
+        <w:pStyle w:val="BodyText"/>
+      </w:pPr>
+      <w:r>
+        <w:t xml:space="preserve">This site is built from the</w:t>
+      </w:r>
+      <w:r>
+        <w:t xml:space="preserve"> </w:t>
+      </w:r>
+      <w:hyperlink r:id="rId27">
+        <w:r>
+          <w:rPr>
+            <w:rStyle w:val="Hyperlink"/>
+          </w:rPr>
+          <w:t xml:space="preserve">qwt</w:t>
+        </w:r>
+      </w:hyperlink>
+      <w:r>
+        <w:t xml:space="preserve"> </w:t>
+      </w:r>
+      <w:r>
+        <w:t xml:space="preserve">Quarto website template,</w:t>
+      </w:r>
+      <w:r>
+        <w:t xml:space="preserve"> </w:t>
+      </w:r>
+      <w:r>
+        <w:t xml:space="preserve">whose structure also comes from the UCD-SERG lab manual.</w:t>
+      </w:r>
+    </w:p>
+    <w:bookmarkEnd w:id="28"/>
+    <w:bookmarkEnd w:id="29"/>
     <w:sectPr>
       <w:footnotePr>
         <w:numRestart w:val="eachSect"/>

</xml_diff>

<commit_message>
Deploying to gh-pages from @ Morrison-Lab/psc@c31721eede5635a519b7b410c49f89ff40860d7f 🚀
</commit_message>
<xml_diff>
--- a/index.docx
+++ b/index.docx
@@ -15,10 +15,10 @@
         <w:pStyle w:val="Date"/>
       </w:pPr>
       <w:r>
-        <w:t xml:space="preserve">Last modified: 2026-10-11 19:47:18 (PDT)</w:t>
-      </w:r>
-    </w:p>
-    <w:bookmarkStart w:id="29" w:name="welcome"/>
+        <w:t xml:space="preserve">Last modified: 2026-10-11 20:59:42 (PDT)</w:t>
+      </w:r>
+    </w:p>
+    <w:bookmarkStart w:id="32" w:name="welcome"/>
     <w:p>
       <w:pPr>
         <w:pStyle w:val="Heading1"/>
@@ -669,7 +669,112 @@
       </w:r>
     </w:p>
     <w:bookmarkEnd w:id="28"/>
-    <w:bookmarkEnd w:id="29"/>
+    <w:bookmarkStart w:id="31" w:name="license"/>
+    <w:p>
+      <w:pPr>
+        <w:pStyle w:val="Heading2"/>
+      </w:pPr>
+      <w:r>
+        <w:t xml:space="preserve">License</w:t>
+      </w:r>
+    </w:p>
+    <w:p>
+      <w:pPr>
+        <w:pStyle w:val="FirstParagraph"/>
+      </w:pPr>
+      <w:r>
+        <w:t xml:space="preserve">The text of this site, including the code examples on its pages,</w:t>
+      </w:r>
+      <w:r>
+        <w:t xml:space="preserve"> </w:t>
+      </w:r>
+      <w:r>
+        <w:t xml:space="preserve">is licensed under the</w:t>
+      </w:r>
+      <w:r>
+        <w:t xml:space="preserve"> </w:t>
+      </w:r>
+      <w:hyperlink r:id="rId29">
+        <w:r>
+          <w:rPr>
+            <w:rStyle w:val="Hyperlink"/>
+          </w:rPr>
+          <w:t xml:space="preserve">Creative Commons Attribution-NonCommercial 4.0 International License (CC BY-NC 4.0)</w:t>
+        </w:r>
+      </w:hyperlink>
+      <w:r>
+        <w:t xml:space="preserve">,</w:t>
+      </w:r>
+      <w:r>
+        <w:t xml:space="preserve"> </w:t>
+      </w:r>
+      <w:r>
+        <w:t xml:space="preserve">the license that the UCD-SERG lab manual and the Benjamin-Chung Lab Manual</w:t>
+      </w:r>
+      <w:r>
+        <w:t xml:space="preserve"> </w:t>
+      </w:r>
+      <w:r>
+        <w:t xml:space="preserve">state on their home pages.</w:t>
+      </w:r>
+      <w:r>
+        <w:t xml:space="preserve"> </w:t>
+      </w:r>
+      <w:r>
+        <w:t xml:space="preserve">Reuse of that text must credit the authors named under Origin above.</w:t>
+      </w:r>
+    </w:p>
+    <w:p>
+      <w:pPr>
+        <w:pStyle w:val="BodyText"/>
+      </w:pPr>
+      <w:r>
+        <w:t xml:space="preserve">The rest of the repository’s code, such as its R package, scripts, and workflows,</w:t>
+      </w:r>
+      <w:r>
+        <w:t xml:space="preserve"> </w:t>
+      </w:r>
+      <w:r>
+        <w:t xml:space="preserve">is licensed under the MIT License; see</w:t>
+      </w:r>
+      <w:r>
+        <w:t xml:space="preserve"> </w:t>
+      </w:r>
+      <w:hyperlink r:id="rId30">
+        <w:r>
+          <w:rPr>
+            <w:rStyle w:val="VerbatimChar"/>
+          </w:rPr>
+          <w:t xml:space="preserve">LICENSE</w:t>
+        </w:r>
+      </w:hyperlink>
+      <w:r>
+        <w:t xml:space="preserve">.</w:t>
+      </w:r>
+      <w:r>
+        <w:t xml:space="preserve"> </w:t>
+      </w:r>
+      <w:r>
+        <w:t xml:space="preserve">Quarto extensions copied into</w:t>
+      </w:r>
+      <w:r>
+        <w:t xml:space="preserve"> </w:t>
+      </w:r>
+      <w:r>
+        <w:rPr>
+          <w:rStyle w:val="VerbatimChar"/>
+        </w:rPr>
+        <w:t xml:space="preserve">_extensions/</w:t>
+      </w:r>
+      <w:r>
+        <w:t xml:space="preserve"> </w:t>
+      </w:r>
+      <w:r>
+        <w:t xml:space="preserve">keep their own licenses.</w:t>
+      </w:r>
+    </w:p>
+    <w:bookmarkEnd w:id="31"/>
+    <w:bookmarkEnd w:id="32"/>
     <w:sectPr>
       <w:footnotePr>
         <w:numRestart w:val="eachSect"/>

</xml_diff>